<commit_message>
Rename repo references: migration-lab → migration-lab-pg
</commit_message>
<xml_diff>
--- a/migration-lab/docs/Migration_HandsOn_Workbook.docx
+++ b/migration-lab/docs/Migration_HandsOn_Workbook.docx
@@ -774,7 +774,7 @@
           <w:szCs w:val="20"/>
           <w:shd w:fill="F4F4F4" w:color="auto" w:val="clear"/>
         </w:rPr>
-        <w:t xml:space="preserve">source ~/.migration-lab-env</w:t>
+        <w:t xml:space="preserve">source ~/.migration-lab-pg-env</w:t>
       </w:r>
       <w:r>
         <w:rPr>
@@ -8899,7 +8899,7 @@
                 <w:sz w:val="19"/>
                 <w:szCs w:val="19"/>
               </w:rPr>
-              <w:t xml:space="preserve">curl -fsSL https://raw.githubusercontent.com/jhjwlee/migration-lab/main/scripts/bootstrap.sh -o bootstrap.sh</w:t>
+              <w:t xml:space="preserve">curl -fsSL https://raw.githubusercontent.com/jhjwlee/migration-lab-pg/main/scripts/bootstrap.sh -o bootstrap.sh</w:t>
             </w:r>
           </w:p>
           <w:p>
@@ -9757,7 +9757,7 @@
                 <w:szCs w:val="20"/>
                 <w:shd w:fill="F4F4F4" w:color="auto" w:val="clear"/>
               </w:rPr>
-              <w:t xml:space="preserve">rg-migration-lab-jhj</w:t>
+              <w:t xml:space="preserve">rg-migration-lab-pg-jhj</w:t>
             </w:r>
             <w:r>
               <w:rPr>
@@ -10203,7 +10203,7 @@
                 <w:sz w:val="19"/>
                 <w:szCs w:val="19"/>
               </w:rPr>
-              <w:t xml:space="preserve">Resource Group: rg-migration-lab</w:t>
+              <w:t xml:space="preserve">Resource Group: rg-migration-lab-pg</w:t>
             </w:r>
           </w:p>
         </w:tc>
@@ -10779,7 +10779,7 @@
                 <w:sz w:val="19"/>
                 <w:szCs w:val="19"/>
               </w:rPr>
-              <w:t xml:space="preserve">환경변수 파일 ~/.migration-lab-env</w:t>
+              <w:t xml:space="preserve">환경변수 파일 ~/.migration-lab-pg-env</w:t>
             </w:r>
           </w:p>
         </w:tc>
@@ -10896,7 +10896,7 @@
                 <w:sz w:val="19"/>
                 <w:szCs w:val="19"/>
               </w:rPr>
-              <w:t xml:space="preserve">source ~/.migration-lab-env</w:t>
+              <w:t xml:space="preserve">source ~/.migration-lab-pg-env</w:t>
             </w:r>
           </w:p>
           <w:p>
@@ -10924,7 +10924,7 @@
                 <w:sz w:val="19"/>
                 <w:szCs w:val="19"/>
               </w:rPr>
-              <w:t xml:space="preserve">echo $RG       # rg-migration-lab</w:t>
+              <w:t xml:space="preserve">echo $RG       # rg-migration-lab-pg</w:t>
             </w:r>
           </w:p>
           <w:p>
@@ -11051,7 +11051,7 @@
                 <w:sz w:val="21"/>
                 <w:szCs w:val="21"/>
               </w:rPr>
-              <w:t xml:space="preserve">보안상 LAB_PWD는 ~/.migration-lab-env에 저장되지 않습니다.</w:t>
+              <w:t xml:space="preserve">보안상 LAB_PWD는 ~/.migration-lab-pg-env에 저장되지 않습니다.</w:t>
             </w:r>
           </w:p>
           <w:p>
@@ -16528,7 +16528,7 @@
                 <w:sz w:val="19"/>
                 <w:szCs w:val="19"/>
               </w:rPr>
-              <w:t xml:space="preserve">source ~/.migration-lab-env</w:t>
+              <w:t xml:space="preserve">source ~/.migration-lab-pg-env</w:t>
             </w:r>
           </w:p>
           <w:p>
@@ -16651,7 +16651,7 @@
                 <w:sz w:val="19"/>
                 <w:szCs w:val="19"/>
               </w:rPr>
-              <w:t xml:space="preserve">source ~/.migration-lab-env</w:t>
+              <w:t xml:space="preserve">source ~/.migration-lab-pg-env</w:t>
             </w:r>
           </w:p>
           <w:p>
@@ -29826,7 +29826,7 @@
                 <w:sz w:val="19"/>
                 <w:szCs w:val="19"/>
               </w:rPr>
-              <w:t xml:space="preserve">curl -fsSL https://raw.githubusercontent.com/jhjwlee/migration-lab/main/scripts/cleanup.sh | bash</w:t>
+              <w:t xml:space="preserve">curl -fsSL https://raw.githubusercontent.com/jhjwlee/migration-lab-pg/main/scripts/cleanup.sh | bash</w:t>
             </w:r>
           </w:p>
         </w:tc>
@@ -40527,7 +40527,7 @@
                 <w:sz w:val="19"/>
                 <w:szCs w:val="19"/>
               </w:rPr>
-              <w:t xml:space="preserve">curl -fsSL https://raw.githubusercontent.com/jhjwlee/migration-lab/main/scripts/bootstrap.sh -o bootstrap.sh</w:t>
+              <w:t xml:space="preserve">curl -fsSL https://raw.githubusercontent.com/jhjwlee/migration-lab-pg/main/scripts/bootstrap.sh -o bootstrap.sh</w:t>
             </w:r>
           </w:p>
           <w:p>

</xml_diff>